<commit_message>
Changed position of Suggest
</commit_message>
<xml_diff>
--- a/examples/GREG_Feasibility_Process_v1-DEMO-TABLE.docx
+++ b/examples/GREG_Feasibility_Process_v1-DEMO-TABLE.docx
@@ -8958,7 +8958,7 @@
       </w:tr>
       <w:tr>
         <w:trPr>
-          <w:trHeight w:val="279" w:hRule="atLeast"/>
+          <w:trHeight w:val="207" w:hRule="atLeast"/>
         </w:trPr>
         <w:tc>
           <w:tcPr>
@@ -9026,6 +9026,552 @@
         </w:rPr>
       </w:r>
     </w:p>
+    <w:tbl>
+      <w:tblPr>
+        <w:tblW w:w="10117" w:type="dxa"/>
+        <w:jc w:val="start"/>
+        <w:tblInd w:w="-187" w:type="dxa"/>
+        <w:tblLayout w:type="fixed"/>
+        <w:tblCellMar>
+          <w:top w:w="0" w:type="dxa"/>
+          <w:start w:w="7" w:type="dxa"/>
+          <w:bottom w:w="0" w:type="dxa"/>
+          <w:end w:w="7" w:type="dxa"/>
+        </w:tblCellMar>
+      </w:tblPr>
+      <w:tblGrid>
+        <w:gridCol w:w="3600"/>
+        <w:gridCol w:w="3067"/>
+        <w:gridCol w:w="3450"/>
+      </w:tblGrid>
+      <w:tr>
+        <w:trPr>
+          <w:trHeight w:val="722" w:hRule="exact"/>
+          <w:cantSplit w:val="true"/>
+        </w:trPr>
+        <w:tc>
+          <w:tcPr>
+            <w:tcW w:w="3600" w:type="dxa"/>
+            <w:tcBorders>
+              <w:top w:val="single" w:sz="12" w:space="0" w:color="111111"/>
+              <w:start w:val="single" w:sz="12" w:space="0" w:color="111111"/>
+              <w:bottom w:val="single" w:sz="12" w:space="0" w:color="111111"/>
+            </w:tcBorders>
+            <w:shd w:fill="B4C7DC" w:val="clear"/>
+          </w:tcPr>
+          <w:p>
+            <w:pPr>
+              <w:pStyle w:val="Normal"/>
+              <w:spacing w:lineRule="exact" w:line="140" w:before="0" w:after="11"/>
+              <w:rPr>
+                <w:rFonts w:ascii="Calibri" w:hAnsi="Calibri" w:eastAsia="Calibri" w:cs="Calibri"/>
+                <w:b/>
+                <w:bCs/>
+                <w:sz w:val="14"/>
+                <w:szCs w:val="14"/>
+              </w:rPr>
+            </w:pPr>
+            <w:r>
+              <w:rPr>
+                <w:rFonts w:eastAsia="Calibri" w:cs="Calibri"/>
+                <w:b/>
+                <w:bCs/>
+                <w:sz w:val="14"/>
+                <w:szCs w:val="14"/>
+              </w:rPr>
+            </w:r>
+          </w:p>
+          <w:p>
+            <w:pPr>
+              <w:pStyle w:val="Normal"/>
+              <w:widowControl w:val="false"/>
+              <w:spacing w:lineRule="auto" w:line="240" w:before="0" w:after="0"/>
+              <w:ind w:hanging="0" w:start="21" w:end="-20"/>
+              <w:rPr>
+                <w:b/>
+                <w:bCs/>
+              </w:rPr>
+            </w:pPr>
+            <w:r>
+              <w:rPr>
+                <w:rFonts w:eastAsia="NLGCQ+GillSans" w:cs="NLGCQ+GillSans" w:ascii="NLGCQ+GillSans" w:hAnsi="NLGCQ+GillSans"/>
+                <w:b/>
+                <w:bCs/>
+                <w:i w:val="false"/>
+                <w:iCs w:val="false"/>
+                <w:strike w:val="false"/>
+                <w:dstrike w:val="false"/>
+                <w:outline w:val="false"/>
+                <w:color w:val="000000"/>
+                <w:spacing w:val="0"/>
+                <w:w w:val="99"/>
+                <w:sz w:val="22"/>
+                <w:szCs w:val="22"/>
+                <w:u w:val="none"/>
+              </w:rPr>
+              <w:t>R</w:t>
+            </w:r>
+            <w:r>
+              <w:rPr>
+                <w:rFonts w:eastAsia="NLGCQ+GillSans" w:cs="NLGCQ+GillSans" w:ascii="NLGCQ+GillSans" w:hAnsi="NLGCQ+GillSans"/>
+                <w:b/>
+                <w:bCs/>
+                <w:i w:val="false"/>
+                <w:iCs w:val="false"/>
+                <w:strike w:val="false"/>
+                <w:dstrike w:val="false"/>
+                <w:outline w:val="false"/>
+                <w:color w:val="000000"/>
+                <w:spacing w:val="0"/>
+                <w:w w:val="99"/>
+                <w:sz w:val="22"/>
+                <w:szCs w:val="22"/>
+                <w:u w:val="none"/>
+              </w:rPr>
+              <w:t>i</w:t>
+            </w:r>
+            <w:r>
+              <w:rPr>
+                <w:rFonts w:eastAsia="NLGCQ+GillSans" w:cs="NLGCQ+GillSans" w:ascii="NLGCQ+GillSans" w:hAnsi="NLGCQ+GillSans"/>
+                <w:b/>
+                <w:bCs/>
+                <w:i w:val="false"/>
+                <w:iCs w:val="false"/>
+                <w:strike w:val="false"/>
+                <w:dstrike w:val="false"/>
+                <w:outline w:val="false"/>
+                <w:color w:val="000000"/>
+                <w:spacing w:val="0"/>
+                <w:w w:val="99"/>
+                <w:sz w:val="22"/>
+                <w:szCs w:val="22"/>
+                <w:u w:val="none"/>
+              </w:rPr>
+              <w:t>s</w:t>
+            </w:r>
+            <w:r>
+              <w:rPr>
+                <w:rFonts w:eastAsia="NLGCQ+GillSans" w:cs="NLGCQ+GillSans" w:ascii="NLGCQ+GillSans" w:hAnsi="NLGCQ+GillSans"/>
+                <w:b/>
+                <w:bCs/>
+                <w:i w:val="false"/>
+                <w:iCs w:val="false"/>
+                <w:strike w:val="false"/>
+                <w:dstrike w:val="false"/>
+                <w:outline w:val="false"/>
+                <w:color w:val="000000"/>
+                <w:spacing w:val="0"/>
+                <w:w w:val="99"/>
+                <w:sz w:val="22"/>
+                <w:szCs w:val="22"/>
+                <w:u w:val="none"/>
+              </w:rPr>
+              <w:t>k</w:t>
+            </w:r>
+          </w:p>
+        </w:tc>
+        <w:tc>
+          <w:tcPr>
+            <w:tcW w:w="3067" w:type="dxa"/>
+            <w:tcBorders>
+              <w:top w:val="single" w:sz="12" w:space="0" w:color="111111"/>
+              <w:start w:val="single" w:sz="12" w:space="0" w:color="111111"/>
+              <w:bottom w:val="single" w:sz="12" w:space="0" w:color="111111"/>
+            </w:tcBorders>
+            <w:shd w:fill="B4C7DC" w:val="clear"/>
+          </w:tcPr>
+          <w:p>
+            <w:pPr>
+              <w:pStyle w:val="Normal"/>
+              <w:spacing w:lineRule="exact" w:line="140" w:before="0" w:after="11"/>
+              <w:rPr>
+                <w:rFonts w:ascii="Calibri" w:hAnsi="Calibri" w:eastAsia="Calibri" w:cs="Calibri"/>
+                <w:b/>
+                <w:bCs/>
+                <w:sz w:val="14"/>
+                <w:szCs w:val="14"/>
+              </w:rPr>
+            </w:pPr>
+            <w:r>
+              <w:rPr>
+                <w:rFonts w:eastAsia="Calibri" w:cs="Calibri"/>
+                <w:b/>
+                <w:bCs/>
+                <w:sz w:val="14"/>
+                <w:szCs w:val="14"/>
+              </w:rPr>
+            </w:r>
+          </w:p>
+          <w:p>
+            <w:pPr>
+              <w:pStyle w:val="Normal"/>
+              <w:widowControl w:val="false"/>
+              <w:spacing w:lineRule="auto" w:line="240" w:before="0" w:after="0"/>
+              <w:ind w:hanging="0" w:start="9" w:end="-20"/>
+              <w:rPr>
+                <w:b/>
+                <w:bCs/>
+              </w:rPr>
+            </w:pPr>
+            <w:r>
+              <w:rPr>
+                <w:b/>
+                <w:bCs/>
+              </w:rPr>
+              <w:t>Likelihood</w:t>
+            </w:r>
+          </w:p>
+        </w:tc>
+        <w:tc>
+          <w:tcPr>
+            <w:tcW w:w="3450" w:type="dxa"/>
+            <w:tcBorders>
+              <w:top w:val="single" w:sz="12" w:space="0" w:color="111111"/>
+              <w:start w:val="single" w:sz="12" w:space="0" w:color="111111"/>
+              <w:bottom w:val="single" w:sz="12" w:space="0" w:color="111111"/>
+              <w:end w:val="single" w:sz="12" w:space="0" w:color="111111"/>
+            </w:tcBorders>
+            <w:shd w:fill="B4C7DC" w:val="clear"/>
+          </w:tcPr>
+          <w:p>
+            <w:pPr>
+              <w:pStyle w:val="Normal"/>
+              <w:spacing w:lineRule="exact" w:line="140" w:before="0" w:after="11"/>
+              <w:rPr>
+                <w:rFonts w:ascii="Calibri" w:hAnsi="Calibri" w:eastAsia="Calibri" w:cs="Calibri"/>
+                <w:b/>
+                <w:bCs/>
+                <w:sz w:val="14"/>
+                <w:szCs w:val="14"/>
+              </w:rPr>
+            </w:pPr>
+            <w:r>
+              <w:rPr>
+                <w:rFonts w:eastAsia="Calibri" w:cs="Calibri"/>
+                <w:b/>
+                <w:bCs/>
+                <w:sz w:val="14"/>
+                <w:szCs w:val="14"/>
+              </w:rPr>
+            </w:r>
+          </w:p>
+          <w:p>
+            <w:pPr>
+              <w:pStyle w:val="Normal"/>
+              <w:widowControl w:val="false"/>
+              <w:spacing w:lineRule="auto" w:line="240" w:before="0" w:after="0"/>
+              <w:ind w:hanging="0" w:start="9" w:end="-20"/>
+              <w:rPr>
+                <w:b/>
+                <w:bCs/>
+              </w:rPr>
+            </w:pPr>
+            <w:r>
+              <w:rPr>
+                <w:b/>
+                <w:bCs/>
+              </w:rPr>
+              <w:t>Impact</w:t>
+            </w:r>
+          </w:p>
+        </w:tc>
+      </w:tr>
+      <w:tr>
+        <w:trPr>
+          <w:trHeight w:val="1099" w:hRule="exact"/>
+          <w:cantSplit w:val="true"/>
+        </w:trPr>
+        <w:tc>
+          <w:tcPr>
+            <w:tcW w:w="3600" w:type="dxa"/>
+            <w:tcBorders>
+              <w:top w:val="single" w:sz="6" w:space="0" w:color="000000"/>
+              <w:start w:val="single" w:sz="6" w:space="0" w:color="000000"/>
+              <w:bottom w:val="single" w:sz="6" w:space="0" w:color="000000"/>
+              <w:end w:val="single" w:sz="6" w:space="0" w:color="000000"/>
+            </w:tcBorders>
+          </w:tcPr>
+          <w:p>
+            <w:pPr>
+              <w:pStyle w:val="TableContents"/>
+              <w:rPr>
+                <w:b w:val="false"/>
+                <w:bCs w:val="false"/>
+                <w:u w:val="single"/>
+              </w:rPr>
+            </w:pPr>
+            <w:r>
+              <w:rPr>
+                <w:b w:val="false"/>
+                <w:bCs w:val="false"/>
+                <w:u w:val="single"/>
+              </w:rPr>
+              <w:t>{%tr for row in risk_table %}</w:t>
+            </w:r>
+          </w:p>
+        </w:tc>
+        <w:tc>
+          <w:tcPr>
+            <w:tcW w:w="3067" w:type="dxa"/>
+            <w:tcBorders>
+              <w:top w:val="single" w:sz="6" w:space="0" w:color="000000"/>
+              <w:start w:val="single" w:sz="6" w:space="0" w:color="000000"/>
+              <w:bottom w:val="single" w:sz="6" w:space="0" w:color="000000"/>
+            </w:tcBorders>
+          </w:tcPr>
+          <w:p>
+            <w:pPr>
+              <w:pStyle w:val="TableContents"/>
+              <w:rPr>
+                <w:b w:val="false"/>
+                <w:bCs w:val="false"/>
+                <w:u w:val="single"/>
+              </w:rPr>
+            </w:pPr>
+            <w:r>
+              <w:rPr>
+                <w:b w:val="false"/>
+                <w:bCs w:val="false"/>
+                <w:u w:val="single"/>
+              </w:rPr>
+            </w:r>
+          </w:p>
+        </w:tc>
+        <w:tc>
+          <w:tcPr>
+            <w:tcW w:w="3450" w:type="dxa"/>
+            <w:tcBorders>
+              <w:top w:val="single" w:sz="6" w:space="0" w:color="000000"/>
+              <w:start w:val="single" w:sz="6" w:space="0" w:color="000000"/>
+              <w:bottom w:val="single" w:sz="6" w:space="0" w:color="000000"/>
+              <w:end w:val="single" w:sz="6" w:space="0" w:color="000000"/>
+            </w:tcBorders>
+          </w:tcPr>
+          <w:p>
+            <w:pPr>
+              <w:pStyle w:val="TableContents"/>
+              <w:rPr>
+                <w:b w:val="false"/>
+                <w:bCs w:val="false"/>
+                <w:u w:val="single"/>
+              </w:rPr>
+            </w:pPr>
+            <w:r>
+              <w:rPr>
+                <w:b w:val="false"/>
+                <w:bCs w:val="false"/>
+                <w:u w:val="single"/>
+              </w:rPr>
+            </w:r>
+          </w:p>
+        </w:tc>
+      </w:tr>
+      <w:tr>
+        <w:trPr>
+          <w:trHeight w:val="1160" w:hRule="exact"/>
+          <w:cantSplit w:val="true"/>
+        </w:trPr>
+        <w:tc>
+          <w:tcPr>
+            <w:tcW w:w="3600" w:type="dxa"/>
+            <w:tcBorders>
+              <w:top w:val="single" w:sz="6" w:space="0" w:color="000000"/>
+              <w:start w:val="single" w:sz="6" w:space="0" w:color="000000"/>
+              <w:bottom w:val="single" w:sz="6" w:space="0" w:color="000000"/>
+              <w:end w:val="single" w:sz="6" w:space="0" w:color="000000"/>
+            </w:tcBorders>
+          </w:tcPr>
+          <w:p>
+            <w:pPr>
+              <w:pStyle w:val="TableContents"/>
+              <w:rPr>
+                <w:b w:val="false"/>
+                <w:bCs w:val="false"/>
+                <w:u w:val="single"/>
+              </w:rPr>
+            </w:pPr>
+            <w:r>
+              <w:rPr>
+                <w:b w:val="false"/>
+                <w:bCs w:val="false"/>
+                <w:u w:val="single"/>
+              </w:rPr>
+              <w:t xml:space="preserve"> </w:t>
+            </w:r>
+            <w:r>
+              <w:rPr>
+                <w:b w:val="false"/>
+                <w:bCs w:val="false"/>
+                <w:u w:val="single"/>
+              </w:rPr>
+              <w:t>{{ row.risk }}</w:t>
+            </w:r>
+          </w:p>
+        </w:tc>
+        <w:tc>
+          <w:tcPr>
+            <w:tcW w:w="3067" w:type="dxa"/>
+            <w:tcBorders>
+              <w:top w:val="single" w:sz="6" w:space="0" w:color="000000"/>
+              <w:start w:val="single" w:sz="6" w:space="0" w:color="000000"/>
+              <w:bottom w:val="single" w:sz="6" w:space="0" w:color="000000"/>
+            </w:tcBorders>
+          </w:tcPr>
+          <w:p>
+            <w:pPr>
+              <w:pStyle w:val="TableContents"/>
+              <w:rPr>
+                <w:b w:val="false"/>
+                <w:bCs w:val="false"/>
+                <w:u w:val="single"/>
+              </w:rPr>
+            </w:pPr>
+            <w:r>
+              <w:rPr>
+                <w:b w:val="false"/>
+                <w:bCs w:val="false"/>
+                <w:u w:val="single"/>
+              </w:rPr>
+              <w:t>{{ row.likelihood }}</w:t>
+            </w:r>
+          </w:p>
+        </w:tc>
+        <w:tc>
+          <w:tcPr>
+            <w:tcW w:w="3450" w:type="dxa"/>
+            <w:tcBorders>
+              <w:top w:val="single" w:sz="6" w:space="0" w:color="000000"/>
+              <w:start w:val="single" w:sz="6" w:space="0" w:color="000000"/>
+              <w:bottom w:val="single" w:sz="6" w:space="0" w:color="000000"/>
+              <w:end w:val="single" w:sz="6" w:space="0" w:color="000000"/>
+            </w:tcBorders>
+          </w:tcPr>
+          <w:p>
+            <w:pPr>
+              <w:pStyle w:val="TableContents"/>
+              <w:rPr>
+                <w:b w:val="false"/>
+                <w:bCs w:val="false"/>
+                <w:u w:val="single"/>
+              </w:rPr>
+            </w:pPr>
+            <w:r>
+              <w:rPr>
+                <w:b w:val="false"/>
+                <w:bCs w:val="false"/>
+                <w:u w:val="single"/>
+              </w:rPr>
+              <w:t>{{ row.impact }}</w:t>
+            </w:r>
+          </w:p>
+        </w:tc>
+      </w:tr>
+      <w:tr>
+        <w:trPr>
+          <w:trHeight w:val="1160" w:hRule="exact"/>
+          <w:cantSplit w:val="true"/>
+        </w:trPr>
+        <w:tc>
+          <w:tcPr>
+            <w:tcW w:w="3600" w:type="dxa"/>
+            <w:tcBorders>
+              <w:start w:val="single" w:sz="6" w:space="0" w:color="000000"/>
+              <w:bottom w:val="single" w:sz="6" w:space="0" w:color="000000"/>
+              <w:end w:val="single" w:sz="6" w:space="0" w:color="000000"/>
+            </w:tcBorders>
+          </w:tcPr>
+          <w:p>
+            <w:pPr>
+              <w:pStyle w:val="TableContents"/>
+              <w:rPr>
+                <w:b w:val="false"/>
+                <w:bCs w:val="false"/>
+                <w:u w:val="single"/>
+              </w:rPr>
+            </w:pPr>
+            <w:r>
+              <w:rPr>
+                <w:b w:val="false"/>
+                <w:bCs w:val="false"/>
+                <w:u w:val="single"/>
+              </w:rPr>
+              <w:t>{%tr endfor %}</w:t>
+            </w:r>
+          </w:p>
+        </w:tc>
+        <w:tc>
+          <w:tcPr>
+            <w:tcW w:w="3067" w:type="dxa"/>
+            <w:tcBorders>
+              <w:start w:val="single" w:sz="6" w:space="0" w:color="000000"/>
+              <w:bottom w:val="single" w:sz="6" w:space="0" w:color="000000"/>
+            </w:tcBorders>
+          </w:tcPr>
+          <w:p>
+            <w:pPr>
+              <w:pStyle w:val="TableContents"/>
+              <w:rPr>
+                <w:b w:val="false"/>
+                <w:bCs w:val="false"/>
+                <w:u w:val="single"/>
+              </w:rPr>
+            </w:pPr>
+            <w:r>
+              <w:rPr>
+                <w:b w:val="false"/>
+                <w:bCs w:val="false"/>
+                <w:u w:val="single"/>
+              </w:rPr>
+            </w:r>
+          </w:p>
+        </w:tc>
+        <w:tc>
+          <w:tcPr>
+            <w:tcW w:w="3450" w:type="dxa"/>
+            <w:tcBorders>
+              <w:start w:val="single" w:sz="6" w:space="0" w:color="000000"/>
+              <w:bottom w:val="single" w:sz="6" w:space="0" w:color="000000"/>
+              <w:end w:val="single" w:sz="6" w:space="0" w:color="000000"/>
+            </w:tcBorders>
+          </w:tcPr>
+          <w:p>
+            <w:pPr>
+              <w:pStyle w:val="TableContents"/>
+              <w:rPr>
+                <w:b w:val="false"/>
+                <w:bCs w:val="false"/>
+                <w:u w:val="single"/>
+              </w:rPr>
+            </w:pPr>
+            <w:r>
+              <w:rPr>
+                <w:b w:val="false"/>
+                <w:bCs w:val="false"/>
+                <w:u w:val="single"/>
+              </w:rPr>
+            </w:r>
+          </w:p>
+        </w:tc>
+      </w:tr>
+    </w:tbl>
+    <w:p>
+      <w:pPr>
+        <w:pStyle w:val="Normal"/>
+        <w:spacing w:lineRule="exact" w:line="240" w:before="0" w:after="107"/>
+        <w:rPr>
+          <w:rFonts w:ascii="Calibri" w:hAnsi="Calibri" w:eastAsia="Calibri" w:cs="Calibri"/>
+          <w:sz w:val="24"/>
+          <w:szCs w:val="24"/>
+        </w:rPr>
+      </w:pPr>
+      <w:r>
+        <w:rPr>
+          <w:rFonts w:eastAsia="Calibri" w:cs="Calibri"/>
+          <w:sz w:val="24"/>
+          <w:szCs w:val="24"/>
+        </w:rPr>
+      </w:r>
+    </w:p>
     <w:p>
       <w:pPr>
         <w:pStyle w:val="Normal"/>
@@ -22251,8 +22797,8 @@
         </w:tblCellMar>
       </w:tblPr>
       <w:tblGrid>
-        <w:gridCol w:w="3504"/>
-        <w:gridCol w:w="6425"/>
+        <w:gridCol w:w="3503"/>
+        <w:gridCol w:w="6426"/>
       </w:tblGrid>
       <w:tr>
         <w:trPr>
@@ -22261,7 +22807,7 @@
         </w:trPr>
         <w:tc>
           <w:tcPr>
-            <w:tcW w:w="3504" w:type="dxa"/>
+            <w:tcW w:w="3503" w:type="dxa"/>
             <w:tcBorders>
               <w:top w:val="single" w:sz="6" w:space="0" w:color="000000"/>
               <w:start w:val="single" w:sz="6" w:space="0" w:color="000000"/>
@@ -22618,7 +23164,7 @@
         </w:tc>
         <w:tc>
           <w:tcPr>
-            <w:tcW w:w="6425" w:type="dxa"/>
+            <w:tcW w:w="6426" w:type="dxa"/>
             <w:tcBorders>
               <w:top w:val="single" w:sz="6" w:space="0" w:color="000000"/>
               <w:start w:val="single" w:sz="6" w:space="0" w:color="000000"/>
@@ -22666,7 +23212,7 @@
         </w:trPr>
         <w:tc>
           <w:tcPr>
-            <w:tcW w:w="3504" w:type="dxa"/>
+            <w:tcW w:w="3503" w:type="dxa"/>
             <w:tcBorders>
               <w:top w:val="single" w:sz="6" w:space="0" w:color="000000"/>
               <w:start w:val="single" w:sz="6" w:space="0" w:color="000000"/>
@@ -22966,7 +23512,7 @@
         </w:tc>
         <w:tc>
           <w:tcPr>
-            <w:tcW w:w="6425" w:type="dxa"/>
+            <w:tcW w:w="6426" w:type="dxa"/>
             <w:tcBorders>
               <w:top w:val="single" w:sz="6" w:space="0" w:color="000000"/>
               <w:start w:val="single" w:sz="6" w:space="0" w:color="000000"/>
@@ -23015,7 +23561,7 @@
         </w:trPr>
         <w:tc>
           <w:tcPr>
-            <w:tcW w:w="3504" w:type="dxa"/>
+            <w:tcW w:w="3503" w:type="dxa"/>
             <w:tcBorders>
               <w:top w:val="single" w:sz="6" w:space="0" w:color="000000"/>
               <w:start w:val="single" w:sz="6" w:space="0" w:color="000000"/>
@@ -23315,7 +23861,7 @@
         </w:tc>
         <w:tc>
           <w:tcPr>
-            <w:tcW w:w="6425" w:type="dxa"/>
+            <w:tcW w:w="6426" w:type="dxa"/>
             <w:tcBorders>
               <w:top w:val="single" w:sz="6" w:space="0" w:color="000000"/>
               <w:start w:val="single" w:sz="6" w:space="0" w:color="000000"/>
@@ -23346,7 +23892,7 @@
         </w:trPr>
         <w:tc>
           <w:tcPr>
-            <w:tcW w:w="3504" w:type="dxa"/>
+            <w:tcW w:w="3503" w:type="dxa"/>
             <w:tcBorders>
               <w:top w:val="single" w:sz="6" w:space="0" w:color="000000"/>
               <w:start w:val="single" w:sz="6" w:space="0" w:color="000000"/>
@@ -23907,7 +24453,7 @@
         </w:tc>
         <w:tc>
           <w:tcPr>
-            <w:tcW w:w="6425" w:type="dxa"/>
+            <w:tcW w:w="6426" w:type="dxa"/>
             <w:tcBorders>
               <w:top w:val="single" w:sz="6" w:space="0" w:color="000000"/>
               <w:start w:val="single" w:sz="6" w:space="0" w:color="000000"/>
@@ -28325,6 +28871,19 @@
     </w:pPr>
     <w:rPr/>
   </w:style>
+  <w:style w:type="paragraph" w:styleId="TableHeading">
+    <w:name w:val="Table Heading"/>
+    <w:basedOn w:val="TableContents"/>
+    <w:qFormat/>
+    <w:pPr>
+      <w:suppressLineNumbers/>
+      <w:jc w:val="center"/>
+    </w:pPr>
+    <w:rPr>
+      <w:b/>
+      <w:bCs/>
+    </w:rPr>
+  </w:style>
 </w:styles>
 </file>
 

</xml_diff>